<commit_message>
chore(ci): archivar deploy-production.yml (Kubernetes nunca usado)
Mueve .github/workflows/deploy-production.yml a docs/archive/workflows/
con una nota explicando por qué: 0 ejecuciones, 0 tags v*.*.*, sin el
secret KUBECONFIG_PRODUCTION y con placeholders de imagen sin personalizar.
El despliegue real es VM + Docker Compose + túnel Cloudflare de host +
Vercel (ver Documentation/PLAN_DE_DESPLIEGUE.md). Actualiza el plan y el
checklist de QA para reflejar que esta desalineación ya está resuelta.

Co-Authored-By: Claude Sonnet 5 <noreply@anthropic.com>
</commit_message>
<xml_diff>
--- a/Documentation/PLAN_DE_DESPLIEGUE.docx
+++ b/Documentation/PLAN_DE_DESPLIEGUE.docx
@@ -1662,7 +1662,7 @@
           <w:i w:val="0"/>
           <w:sz w:val="24"/>
         </w:rPr>
-        <w:t>: existe un workflow (</w:t>
+        <w:t>: existía un workflow (</w:t>
       </w:r>
       <w:r>
         <w:rPr>
@@ -1671,7 +1671,7 @@
           <w:i w:val="0"/>
           <w:sz w:val="18"/>
         </w:rPr>
-        <w:t>.github/workflows/deploy-production.yml</w:t>
+        <w:t>deploy-production.yml</w:t>
       </w:r>
       <w:r>
         <w:rPr>
@@ -1680,7 +1680,7 @@
           <w:i w:val="0"/>
           <w:sz w:val="24"/>
         </w:rPr>
-        <w:t xml:space="preserve">) que despliega a un clúster </w:t>
+        <w:t xml:space="preserve">) que desplegaba a un clúster </w:t>
       </w:r>
       <w:r>
         <w:rPr>
@@ -1716,7 +1716,61 @@
           <w:i w:val="0"/>
           <w:sz w:val="24"/>
         </w:rPr>
-        <w:t xml:space="preserve">). Ese flujo </w:t>
+        <w:t xml:space="preserve">). Ese flujo no reflejaba la infraestructura real en uso, que es la descrita arriba (Compose en VM + túnel a nivel de host + Vercel para el web); nunca se ejecutó (0 corridas, 0 tags </w:t>
+      </w:r>
+      <w:r>
+        <w:rPr>
+          <w:rFonts w:ascii="Consolas" w:hAnsi="Consolas" w:cs="Consolas"/>
+          <w:b w:val="0"/>
+          <w:i w:val="0"/>
+          <w:sz w:val="18"/>
+        </w:rPr>
+        <w:t>v*.*.*</w:t>
+      </w:r>
+      <w:r>
+        <w:rPr>
+          <w:rFonts w:ascii="Times New Roman" w:hAnsi="Times New Roman" w:cs="Times New Roman"/>
+          <w:b w:val="0"/>
+          <w:i w:val="0"/>
+          <w:sz w:val="24"/>
+        </w:rPr>
+        <w:t xml:space="preserve">, sin el secret </w:t>
+      </w:r>
+      <w:r>
+        <w:rPr>
+          <w:rFonts w:ascii="Consolas" w:hAnsi="Consolas" w:cs="Consolas"/>
+          <w:b w:val="0"/>
+          <w:i w:val="0"/>
+          <w:sz w:val="18"/>
+        </w:rPr>
+        <w:t>KUBECONFIG_PRODUCTION</w:t>
+      </w:r>
+      <w:r>
+        <w:rPr>
+          <w:rFonts w:ascii="Times New Roman" w:hAnsi="Times New Roman" w:cs="Times New Roman"/>
+          <w:b w:val="0"/>
+          <w:i w:val="0"/>
+          <w:sz w:val="24"/>
+        </w:rPr>
+        <w:t xml:space="preserve">). Se archivó en </w:t>
+      </w:r>
+      <w:r>
+        <w:rPr>
+          <w:rFonts w:ascii="Consolas" w:hAnsi="Consolas" w:cs="Consolas"/>
+          <w:b w:val="0"/>
+          <w:i w:val="0"/>
+          <w:sz w:val="18"/>
+        </w:rPr>
+        <w:t>docs/archive/workflows/deploy-production.yml</w:t>
+      </w:r>
+      <w:r>
+        <w:rPr>
+          <w:rFonts w:ascii="Times New Roman" w:hAnsi="Times New Roman" w:cs="Times New Roman"/>
+          <w:b w:val="0"/>
+          <w:i w:val="0"/>
+          <w:sz w:val="24"/>
+        </w:rPr>
+        <w:t xml:space="preserve"> para que deje de listarse como workflow activo y no contradiga este plan. Este plan documenta el flujo </w:t>
       </w:r>
       <w:r>
         <w:rPr>
@@ -1725,7 +1779,7 @@
           <w:i w:val="0"/>
           <w:sz w:val="24"/>
         </w:rPr>
-        <w:t>no refleja la infraestructura real en uso</w:t>
+        <w:t>real</w:t>
       </w:r>
       <w:r>
         <w:rPr>
@@ -1734,25 +1788,7 @@
           <w:i w:val="0"/>
           <w:sz w:val="24"/>
         </w:rPr>
-        <w:t xml:space="preserve">, que es la descrita arriba (Compose en VM + túnel a nivel de host + Vercel para el web). Este plan documenta el flujo </w:t>
-      </w:r>
-      <w:r>
-        <w:rPr>
-          <w:rFonts w:ascii="Times New Roman" w:hAnsi="Times New Roman" w:cs="Times New Roman"/>
-          <w:b/>
-          <w:i w:val="0"/>
-          <w:sz w:val="24"/>
-        </w:rPr>
-        <w:t>real</w:t>
-      </w:r>
-      <w:r>
-        <w:rPr>
-          <w:rFonts w:ascii="Times New Roman" w:hAnsi="Times New Roman" w:cs="Times New Roman"/>
-          <w:b w:val="0"/>
-          <w:i w:val="0"/>
-          <w:sz w:val="24"/>
-        </w:rPr>
-        <w:t>. El workflow de Kubernetes debe marcarse como no vigente, actualizarse o eliminarse para no generar contradicciones en la documentación de entrega.</w:t>
+        <w:t>.</w:t>
       </w:r>
     </w:p>
     <w:p>
@@ -7528,11 +7564,38 @@
       <w:r>
         <w:rPr>
           <w:rFonts w:ascii="Times New Roman" w:hAnsi="Times New Roman" w:cs="Times New Roman"/>
+          <w:b w:val="0"/>
+          <w:i w:val="0"/>
+          <w:sz w:val="24"/>
+        </w:rPr>
+        <w:t>~~</w:t>
+      </w:r>
+      <w:r>
+        <w:rPr>
+          <w:rFonts w:ascii="Consolas" w:hAnsi="Consolas" w:cs="Consolas"/>
+          <w:b w:val="0"/>
+          <w:i w:val="0"/>
+          <w:sz w:val="18"/>
+        </w:rPr>
+        <w:t>deploy-production.yml</w:t>
+      </w:r>
+      <w:r>
+        <w:rPr>
+          <w:rFonts w:ascii="Times New Roman" w:hAnsi="Times New Roman" w:cs="Times New Roman"/>
+          <w:b w:val="0"/>
+          <w:i w:val="0"/>
+          <w:sz w:val="24"/>
+        </w:rPr>
+        <w:t xml:space="preserve"> (Kubernetes) desalineado con la infraestructura real~~ — </w:t>
+      </w:r>
+      <w:r>
+        <w:rPr>
+          <w:rFonts w:ascii="Times New Roman" w:hAnsi="Times New Roman" w:cs="Times New Roman"/>
           <w:b/>
           <w:i w:val="0"/>
           <w:sz w:val="24"/>
         </w:rPr>
-        <w:t>`deploy-production.yml` (Kubernetes) está desalineado</w:t>
+        <w:t>resuelto</w:t>
       </w:r>
       <w:r>
         <w:rPr>
@@ -7541,7 +7604,43 @@
           <w:i w:val="0"/>
           <w:sz w:val="24"/>
         </w:rPr>
-        <w:t xml:space="preserve"> con la infraestructura real (Compose en VM + túnel de host + Vercel para el web). Decidir si se actualiza o se retira para no contradecir este plan.</w:t>
+        <w:t xml:space="preserve">: nunca se ejecutó (0 corridas, 0 tags, sin secret </w:t>
+      </w:r>
+      <w:r>
+        <w:rPr>
+          <w:rFonts w:ascii="Consolas" w:hAnsi="Consolas" w:cs="Consolas"/>
+          <w:b w:val="0"/>
+          <w:i w:val="0"/>
+          <w:sz w:val="18"/>
+        </w:rPr>
+        <w:t>KUBECONFIG_PRODUCTION</w:t>
+      </w:r>
+      <w:r>
+        <w:rPr>
+          <w:rFonts w:ascii="Times New Roman" w:hAnsi="Times New Roman" w:cs="Times New Roman"/>
+          <w:b w:val="0"/>
+          <w:i w:val="0"/>
+          <w:sz w:val="24"/>
+        </w:rPr>
+        <w:t xml:space="preserve">) y se archivó en </w:t>
+      </w:r>
+      <w:r>
+        <w:rPr>
+          <w:rFonts w:ascii="Consolas" w:hAnsi="Consolas" w:cs="Consolas"/>
+          <w:b w:val="0"/>
+          <w:i w:val="0"/>
+          <w:sz w:val="18"/>
+        </w:rPr>
+        <w:t>docs/archive/workflows/deploy-production.yml</w:t>
+      </w:r>
+      <w:r>
+        <w:rPr>
+          <w:rFonts w:ascii="Times New Roman" w:hAnsi="Times New Roman" w:cs="Times New Roman"/>
+          <w:b w:val="0"/>
+          <w:i w:val="0"/>
+          <w:sz w:val="24"/>
+        </w:rPr>
+        <w:t xml:space="preserve"> con una nota explicando por qué.</w:t>
       </w:r>
     </w:p>
     <w:p>

</xml_diff>

<commit_message>
docs(despliegue): documentar umbrales de rendimiento (SLA) en el plan
Reemplaza el gap de "sin umbrales de rendimiento definidos" en la sección 9
con el SLA real ya verificado en CI (backend/tests/performance/
api-performance.perf.test.ts y concurrency.perf.test.ts): mean/p95/p99 por
tipo de endpoint y throughput mínimo. Marca el gap como resuelto.

Co-Authored-By: Claude Sonnet 5 <noreply@anthropic.com>
</commit_message>
<xml_diff>
--- a/Documentation/PLAN_DE_DESPLIEGUE.docx
+++ b/Documentation/PLAN_DE_DESPLIEGUE.docx
@@ -5394,7 +5394,563 @@
           <w:i w:val="0"/>
           <w:sz w:val="24"/>
         </w:rPr>
-        <w:t xml:space="preserve">: sin umbrales formales definidos aún — </w:t>
+        <w:t>: umbrales SLA ya definidos y verificados en CI contra MongoDB real (</w:t>
+      </w:r>
+      <w:r>
+        <w:rPr>
+          <w:rFonts w:ascii="Consolas" w:hAnsi="Consolas" w:cs="Consolas"/>
+          <w:b w:val="0"/>
+          <w:i w:val="0"/>
+          <w:sz w:val="18"/>
+        </w:rPr>
+        <w:t>backend/tests/performance/api-performance.perf.test.ts</w:t>
+      </w:r>
+      <w:r>
+        <w:rPr>
+          <w:rFonts w:ascii="Times New Roman" w:hAnsi="Times New Roman" w:cs="Times New Roman"/>
+          <w:b w:val="0"/>
+          <w:i w:val="0"/>
+          <w:sz w:val="24"/>
+        </w:rPr>
+        <w:t>), por tipo de endpoint:</w:t>
+      </w:r>
+    </w:p>
+    <w:tbl>
+      <w:tblPr>
+        <w:tblStyle w:val="LightGrid-Accent1"/>
+        <w:tblW w:type="auto" w:w="0"/>
+        <w:tblLook w:firstColumn="1" w:firstRow="1" w:lastColumn="0" w:lastRow="0" w:noHBand="0" w:noVBand="1" w:val="04A0"/>
+      </w:tblPr>
+      <w:tblGrid>
+        <w:gridCol w:w="2268"/>
+        <w:gridCol w:w="2268"/>
+        <w:gridCol w:w="2268"/>
+        <w:gridCol w:w="2268"/>
+      </w:tblGrid>
+      <w:tr>
+        <w:tc>
+          <w:tcPr>
+            <w:tcW w:type="dxa" w:w="2268"/>
+          </w:tcPr>
+          <w:p>
+            <w:pPr>
+              <w:jc w:val="center"/>
+            </w:pPr>
+            <w:r/>
+            <w:r>
+              <w:rPr>
+                <w:rFonts w:ascii="Times New Roman" w:hAnsi="Times New Roman" w:cs="Times New Roman"/>
+                <w:b/>
+                <w:i w:val="0"/>
+                <w:sz w:val="24"/>
+              </w:rPr>
+              <w:t>Tipo de endpoint</w:t>
+            </w:r>
+          </w:p>
+        </w:tc>
+        <w:tc>
+          <w:tcPr>
+            <w:tcW w:type="dxa" w:w="2268"/>
+          </w:tcPr>
+          <w:p>
+            <w:pPr>
+              <w:jc w:val="center"/>
+            </w:pPr>
+            <w:r/>
+            <w:r>
+              <w:rPr>
+                <w:rFonts w:ascii="Times New Roman" w:hAnsi="Times New Roman" w:cs="Times New Roman"/>
+                <w:b/>
+                <w:i w:val="0"/>
+                <w:sz w:val="24"/>
+              </w:rPr>
+              <w:t>mean</w:t>
+            </w:r>
+          </w:p>
+        </w:tc>
+        <w:tc>
+          <w:tcPr>
+            <w:tcW w:type="dxa" w:w="2268"/>
+          </w:tcPr>
+          <w:p>
+            <w:pPr>
+              <w:jc w:val="center"/>
+            </w:pPr>
+            <w:r/>
+            <w:r>
+              <w:rPr>
+                <w:rFonts w:ascii="Times New Roman" w:hAnsi="Times New Roman" w:cs="Times New Roman"/>
+                <w:b/>
+                <w:i w:val="0"/>
+                <w:sz w:val="24"/>
+              </w:rPr>
+              <w:t>p95</w:t>
+            </w:r>
+          </w:p>
+        </w:tc>
+        <w:tc>
+          <w:tcPr>
+            <w:tcW w:type="dxa" w:w="2268"/>
+          </w:tcPr>
+          <w:p>
+            <w:pPr>
+              <w:jc w:val="center"/>
+            </w:pPr>
+            <w:r/>
+            <w:r>
+              <w:rPr>
+                <w:rFonts w:ascii="Times New Roman" w:hAnsi="Times New Roman" w:cs="Times New Roman"/>
+                <w:b/>
+                <w:i w:val="0"/>
+                <w:sz w:val="24"/>
+              </w:rPr>
+              <w:t>p99</w:t>
+            </w:r>
+          </w:p>
+        </w:tc>
+      </w:tr>
+      <w:tr>
+        <w:tc>
+          <w:tcPr>
+            <w:tcW w:type="dxa" w:w="2268"/>
+          </w:tcPr>
+          <w:p>
+            <w:pPr>
+              <w:jc w:val="left"/>
+            </w:pPr>
+            <w:r/>
+            <w:r>
+              <w:rPr>
+                <w:rFonts w:ascii="Times New Roman" w:hAnsi="Times New Roman" w:cs="Times New Roman"/>
+                <w:b w:val="0"/>
+                <w:i w:val="0"/>
+                <w:sz w:val="24"/>
+              </w:rPr>
+              <w:t>Auth (login/register)</w:t>
+            </w:r>
+          </w:p>
+        </w:tc>
+        <w:tc>
+          <w:tcPr>
+            <w:tcW w:type="dxa" w:w="2268"/>
+          </w:tcPr>
+          <w:p>
+            <w:pPr>
+              <w:jc w:val="left"/>
+            </w:pPr>
+            <w:r/>
+            <w:r>
+              <w:rPr>
+                <w:rFonts w:ascii="Times New Roman" w:hAnsi="Times New Roman" w:cs="Times New Roman"/>
+                <w:b w:val="0"/>
+                <w:i w:val="0"/>
+                <w:sz w:val="24"/>
+              </w:rPr>
+              <w:t>&lt; 300ms</w:t>
+            </w:r>
+          </w:p>
+        </w:tc>
+        <w:tc>
+          <w:tcPr>
+            <w:tcW w:type="dxa" w:w="2268"/>
+          </w:tcPr>
+          <w:p>
+            <w:pPr>
+              <w:jc w:val="left"/>
+            </w:pPr>
+            <w:r/>
+            <w:r>
+              <w:rPr>
+                <w:rFonts w:ascii="Times New Roman" w:hAnsi="Times New Roman" w:cs="Times New Roman"/>
+                <w:b w:val="0"/>
+                <w:i w:val="0"/>
+                <w:sz w:val="24"/>
+              </w:rPr>
+              <w:t>&lt; 500ms</w:t>
+            </w:r>
+          </w:p>
+        </w:tc>
+        <w:tc>
+          <w:tcPr>
+            <w:tcW w:type="dxa" w:w="2268"/>
+          </w:tcPr>
+          <w:p>
+            <w:pPr>
+              <w:jc w:val="left"/>
+            </w:pPr>
+            <w:r/>
+            <w:r>
+              <w:rPr>
+                <w:rFonts w:ascii="Times New Roman" w:hAnsi="Times New Roman" w:cs="Times New Roman"/>
+                <w:b w:val="0"/>
+                <w:i w:val="0"/>
+                <w:sz w:val="24"/>
+              </w:rPr>
+              <w:t>&lt; 800ms</w:t>
+            </w:r>
+          </w:p>
+        </w:tc>
+      </w:tr>
+      <w:tr>
+        <w:tc>
+          <w:tcPr>
+            <w:tcW w:type="dxa" w:w="2268"/>
+          </w:tcPr>
+          <w:p>
+            <w:pPr>
+              <w:jc w:val="left"/>
+            </w:pPr>
+            <w:r/>
+            <w:r>
+              <w:rPr>
+                <w:rFonts w:ascii="Times New Roman" w:hAnsi="Times New Roman" w:cs="Times New Roman"/>
+                <w:b w:val="0"/>
+                <w:i w:val="0"/>
+                <w:sz w:val="24"/>
+              </w:rPr>
+              <w:t>Lectura (list/get)</w:t>
+            </w:r>
+          </w:p>
+        </w:tc>
+        <w:tc>
+          <w:tcPr>
+            <w:tcW w:type="dxa" w:w="2268"/>
+          </w:tcPr>
+          <w:p>
+            <w:pPr>
+              <w:jc w:val="left"/>
+            </w:pPr>
+            <w:r/>
+            <w:r>
+              <w:rPr>
+                <w:rFonts w:ascii="Times New Roman" w:hAnsi="Times New Roman" w:cs="Times New Roman"/>
+                <w:b w:val="0"/>
+                <w:i w:val="0"/>
+                <w:sz w:val="24"/>
+              </w:rPr>
+              <w:t>&lt; 200ms</w:t>
+            </w:r>
+          </w:p>
+        </w:tc>
+        <w:tc>
+          <w:tcPr>
+            <w:tcW w:type="dxa" w:w="2268"/>
+          </w:tcPr>
+          <w:p>
+            <w:pPr>
+              <w:jc w:val="left"/>
+            </w:pPr>
+            <w:r/>
+            <w:r>
+              <w:rPr>
+                <w:rFonts w:ascii="Times New Roman" w:hAnsi="Times New Roman" w:cs="Times New Roman"/>
+                <w:b w:val="0"/>
+                <w:i w:val="0"/>
+                <w:sz w:val="24"/>
+              </w:rPr>
+              <w:t>&lt; 400ms</w:t>
+            </w:r>
+          </w:p>
+        </w:tc>
+        <w:tc>
+          <w:tcPr>
+            <w:tcW w:type="dxa" w:w="2268"/>
+          </w:tcPr>
+          <w:p>
+            <w:pPr>
+              <w:jc w:val="left"/>
+            </w:pPr>
+            <w:r/>
+            <w:r>
+              <w:rPr>
+                <w:rFonts w:ascii="Times New Roman" w:hAnsi="Times New Roman" w:cs="Times New Roman"/>
+                <w:b w:val="0"/>
+                <w:i w:val="0"/>
+                <w:sz w:val="24"/>
+              </w:rPr>
+              <w:t>&lt; 600ms</w:t>
+            </w:r>
+          </w:p>
+        </w:tc>
+      </w:tr>
+      <w:tr>
+        <w:tc>
+          <w:tcPr>
+            <w:tcW w:type="dxa" w:w="2268"/>
+          </w:tcPr>
+          <w:p>
+            <w:pPr>
+              <w:jc w:val="left"/>
+            </w:pPr>
+            <w:r/>
+            <w:r>
+              <w:rPr>
+                <w:rFonts w:ascii="Times New Roman" w:hAnsi="Times New Roman" w:cs="Times New Roman"/>
+                <w:b w:val="0"/>
+                <w:i w:val="0"/>
+                <w:sz w:val="24"/>
+              </w:rPr>
+              <w:t>Escritura (create/update)</w:t>
+            </w:r>
+          </w:p>
+        </w:tc>
+        <w:tc>
+          <w:tcPr>
+            <w:tcW w:type="dxa" w:w="2268"/>
+          </w:tcPr>
+          <w:p>
+            <w:pPr>
+              <w:jc w:val="left"/>
+            </w:pPr>
+            <w:r/>
+            <w:r>
+              <w:rPr>
+                <w:rFonts w:ascii="Times New Roman" w:hAnsi="Times New Roman" w:cs="Times New Roman"/>
+                <w:b w:val="0"/>
+                <w:i w:val="0"/>
+                <w:sz w:val="24"/>
+              </w:rPr>
+              <w:t>&lt; 350ms</w:t>
+            </w:r>
+          </w:p>
+        </w:tc>
+        <w:tc>
+          <w:tcPr>
+            <w:tcW w:type="dxa" w:w="2268"/>
+          </w:tcPr>
+          <w:p>
+            <w:pPr>
+              <w:jc w:val="left"/>
+            </w:pPr>
+            <w:r/>
+            <w:r>
+              <w:rPr>
+                <w:rFonts w:ascii="Times New Roman" w:hAnsi="Times New Roman" w:cs="Times New Roman"/>
+                <w:b w:val="0"/>
+                <w:i w:val="0"/>
+                <w:sz w:val="24"/>
+              </w:rPr>
+              <w:t>&lt; 600ms</w:t>
+            </w:r>
+          </w:p>
+        </w:tc>
+        <w:tc>
+          <w:tcPr>
+            <w:tcW w:type="dxa" w:w="2268"/>
+          </w:tcPr>
+          <w:p>
+            <w:pPr>
+              <w:jc w:val="left"/>
+            </w:pPr>
+            <w:r/>
+            <w:r>
+              <w:rPr>
+                <w:rFonts w:ascii="Times New Roman" w:hAnsi="Times New Roman" w:cs="Times New Roman"/>
+                <w:b w:val="0"/>
+                <w:i w:val="0"/>
+                <w:sz w:val="24"/>
+              </w:rPr>
+              <w:t>&lt; 900ms</w:t>
+            </w:r>
+          </w:p>
+        </w:tc>
+      </w:tr>
+      <w:tr>
+        <w:tc>
+          <w:tcPr>
+            <w:tcW w:type="dxa" w:w="2268"/>
+          </w:tcPr>
+          <w:p>
+            <w:pPr>
+              <w:jc w:val="left"/>
+            </w:pPr>
+            <w:r/>
+            <w:r>
+              <w:rPr>
+                <w:rFonts w:ascii="Times New Roman" w:hAnsi="Times New Roman" w:cs="Times New Roman"/>
+                <w:b w:val="0"/>
+                <w:i w:val="0"/>
+                <w:sz w:val="24"/>
+              </w:rPr>
+              <w:t>Analytics/Dashboard</w:t>
+            </w:r>
+          </w:p>
+        </w:tc>
+        <w:tc>
+          <w:tcPr>
+            <w:tcW w:type="dxa" w:w="2268"/>
+          </w:tcPr>
+          <w:p>
+            <w:pPr>
+              <w:jc w:val="left"/>
+            </w:pPr>
+            <w:r/>
+            <w:r>
+              <w:rPr>
+                <w:rFonts w:ascii="Times New Roman" w:hAnsi="Times New Roman" w:cs="Times New Roman"/>
+                <w:b w:val="0"/>
+                <w:i w:val="0"/>
+                <w:sz w:val="24"/>
+              </w:rPr>
+              <w:t>&lt; 400ms</w:t>
+            </w:r>
+          </w:p>
+        </w:tc>
+        <w:tc>
+          <w:tcPr>
+            <w:tcW w:type="dxa" w:w="2268"/>
+          </w:tcPr>
+          <w:p>
+            <w:pPr>
+              <w:jc w:val="left"/>
+            </w:pPr>
+            <w:r/>
+            <w:r>
+              <w:rPr>
+                <w:rFonts w:ascii="Times New Roman" w:hAnsi="Times New Roman" w:cs="Times New Roman"/>
+                <w:b w:val="0"/>
+                <w:i w:val="0"/>
+                <w:sz w:val="24"/>
+              </w:rPr>
+              <w:t>&lt; 700ms</w:t>
+            </w:r>
+          </w:p>
+        </w:tc>
+        <w:tc>
+          <w:tcPr>
+            <w:tcW w:type="dxa" w:w="2268"/>
+          </w:tcPr>
+          <w:p>
+            <w:pPr>
+              <w:jc w:val="left"/>
+            </w:pPr>
+            <w:r/>
+            <w:r>
+              <w:rPr>
+                <w:rFonts w:ascii="Times New Roman" w:hAnsi="Times New Roman" w:cs="Times New Roman"/>
+                <w:b w:val="0"/>
+                <w:i w:val="0"/>
+                <w:sz w:val="24"/>
+              </w:rPr>
+              <w:t>&lt; 1000ms</w:t>
+            </w:r>
+          </w:p>
+        </w:tc>
+      </w:tr>
+      <w:tr>
+        <w:tc>
+          <w:tcPr>
+            <w:tcW w:type="dxa" w:w="2268"/>
+          </w:tcPr>
+          <w:p>
+            <w:pPr>
+              <w:jc w:val="left"/>
+            </w:pPr>
+            <w:r/>
+            <w:r>
+              <w:rPr>
+                <w:rFonts w:ascii="Times New Roman" w:hAnsi="Times New Roman" w:cs="Times New Roman"/>
+                <w:b w:val="0"/>
+                <w:i w:val="0"/>
+                <w:sz w:val="24"/>
+              </w:rPr>
+              <w:t>Búsqueda/filtro</w:t>
+            </w:r>
+          </w:p>
+        </w:tc>
+        <w:tc>
+          <w:tcPr>
+            <w:tcW w:type="dxa" w:w="2268"/>
+          </w:tcPr>
+          <w:p>
+            <w:pPr>
+              <w:jc w:val="left"/>
+            </w:pPr>
+            <w:r/>
+            <w:r>
+              <w:rPr>
+                <w:rFonts w:ascii="Times New Roman" w:hAnsi="Times New Roman" w:cs="Times New Roman"/>
+                <w:b w:val="0"/>
+                <w:i w:val="0"/>
+                <w:sz w:val="24"/>
+              </w:rPr>
+              <w:t>&lt; 250ms</w:t>
+            </w:r>
+          </w:p>
+        </w:tc>
+        <w:tc>
+          <w:tcPr>
+            <w:tcW w:type="dxa" w:w="2268"/>
+          </w:tcPr>
+          <w:p>
+            <w:pPr>
+              <w:jc w:val="left"/>
+            </w:pPr>
+            <w:r/>
+            <w:r>
+              <w:rPr>
+                <w:rFonts w:ascii="Times New Roman" w:hAnsi="Times New Roman" w:cs="Times New Roman"/>
+                <w:b w:val="0"/>
+                <w:i w:val="0"/>
+                <w:sz w:val="24"/>
+              </w:rPr>
+              <w:t>&lt; 450ms</w:t>
+            </w:r>
+          </w:p>
+        </w:tc>
+        <w:tc>
+          <w:tcPr>
+            <w:tcW w:type="dxa" w:w="2268"/>
+          </w:tcPr>
+          <w:p>
+            <w:pPr>
+              <w:jc w:val="left"/>
+            </w:pPr>
+            <w:r/>
+            <w:r>
+              <w:rPr>
+                <w:rFonts w:ascii="Times New Roman" w:hAnsi="Times New Roman" w:cs="Times New Roman"/>
+                <w:b w:val="0"/>
+                <w:i w:val="0"/>
+                <w:sz w:val="24"/>
+              </w:rPr>
+              <w:t>&lt; 700ms</w:t>
+            </w:r>
+          </w:p>
+        </w:tc>
+      </w:tr>
+    </w:tbl>
+    <w:p/>
+    <w:p>
+      <w:pPr>
+        <w:jc w:val="both"/>
+      </w:pPr>
+      <w:r>
+        <w:rPr>
+          <w:rFonts w:ascii="Times New Roman" w:hAnsi="Times New Roman" w:cs="Times New Roman"/>
+          <w:b w:val="0"/>
+          <w:i w:val="0"/>
+          <w:sz w:val="24"/>
+        </w:rPr>
+        <w:t xml:space="preserve">Además, </w:t>
+      </w:r>
+      <w:r>
+        <w:rPr>
+          <w:rFonts w:ascii="Consolas" w:hAnsi="Consolas" w:cs="Consolas"/>
+          <w:b w:val="0"/>
+          <w:i w:val="0"/>
+          <w:sz w:val="18"/>
+        </w:rPr>
+        <w:t>concurrency.perf.test.ts</w:t>
+      </w:r>
+      <w:r>
+        <w:rPr>
+          <w:rFonts w:ascii="Times New Roman" w:hAnsi="Times New Roman" w:cs="Times New Roman"/>
+          <w:b w:val="0"/>
+          <w:i w:val="0"/>
+          <w:sz w:val="24"/>
+        </w:rPr>
+        <w:t xml:space="preserve"> exige un throughput mínimo de </w:t>
       </w:r>
       <w:r>
         <w:rPr>
@@ -5403,7 +5959,7 @@
           <w:i w:val="0"/>
           <w:sz w:val="24"/>
         </w:rPr>
-        <w:t>gap</w:t>
+        <w:t>≥ 5 req/s</w:t>
       </w:r>
       <w:r>
         <w:rPr>
@@ -5412,7 +5968,25 @@
           <w:i w:val="0"/>
           <w:sz w:val="24"/>
         </w:rPr>
-        <w:t xml:space="preserve">: definir al menos latencia aceptable para </w:t>
+        <w:t xml:space="preserve"> en lecturas de historial médico bajo carga paralela, y una degradación bajo carga sostenida </w:t>
+      </w:r>
+      <w:r>
+        <w:rPr>
+          <w:rFonts w:ascii="Times New Roman" w:hAnsi="Times New Roman" w:cs="Times New Roman"/>
+          <w:b/>
+          <w:i w:val="0"/>
+          <w:sz w:val="24"/>
+        </w:rPr>
+        <w:t>&lt; 3x</w:t>
+      </w:r>
+      <w:r>
+        <w:rPr>
+          <w:rFonts w:ascii="Times New Roman" w:hAnsi="Times New Roman" w:cs="Times New Roman"/>
+          <w:b w:val="0"/>
+          <w:i w:val="0"/>
+          <w:sz w:val="24"/>
+        </w:rPr>
+        <w:t xml:space="preserve"> respecto al tiempo base. Criterio de aceptación para el despliegue: estos tests de performance deben pasar en CI (</w:t>
       </w:r>
       <w:r>
         <w:rPr>
@@ -5421,7 +5995,7 @@
           <w:i w:val="0"/>
           <w:sz w:val="18"/>
         </w:rPr>
-        <w:t>/analytics</w:t>
+        <w:t>npm run test:performance</w:t>
       </w:r>
       <w:r>
         <w:rPr>
@@ -5430,7 +6004,115 @@
           <w:i w:val="0"/>
           <w:sz w:val="24"/>
         </w:rPr>
-        <w:t xml:space="preserve"> y el endpoint de análisis IA.</w:t>
+        <w:t xml:space="preserve"> en </w:t>
+      </w:r>
+      <w:r>
+        <w:rPr>
+          <w:rFonts w:ascii="Consolas" w:hAnsi="Consolas" w:cs="Consolas"/>
+          <w:b w:val="0"/>
+          <w:i w:val="0"/>
+          <w:sz w:val="18"/>
+        </w:rPr>
+        <w:t>backend/</w:t>
+      </w:r>
+      <w:r>
+        <w:rPr>
+          <w:rFonts w:ascii="Times New Roman" w:hAnsi="Times New Roman" w:cs="Times New Roman"/>
+          <w:b w:val="0"/>
+          <w:i w:val="0"/>
+          <w:sz w:val="24"/>
+        </w:rPr>
+        <w:t xml:space="preserve">) antes de autorizar el paso a producción; </w:t>
+      </w:r>
+      <w:r>
+        <w:rPr>
+          <w:rFonts w:ascii="Consolas" w:hAnsi="Consolas" w:cs="Consolas"/>
+          <w:b w:val="0"/>
+          <w:i w:val="0"/>
+          <w:sz w:val="18"/>
+        </w:rPr>
+        <w:t>scripts/smoke-test-vm.sh</w:t>
+      </w:r>
+      <w:r>
+        <w:rPr>
+          <w:rFonts w:ascii="Times New Roman" w:hAnsi="Times New Roman" w:cs="Times New Roman"/>
+          <w:b w:val="0"/>
+          <w:i w:val="0"/>
+          <w:sz w:val="24"/>
+        </w:rPr>
+        <w:t xml:space="preserve"> no mide latencia, solo disponibilidad — si se requiere validar el SLA ya en la VM, correrlo manualmente con </w:t>
+      </w:r>
+      <w:r>
+        <w:rPr>
+          <w:rFonts w:ascii="Consolas" w:hAnsi="Consolas" w:cs="Consolas"/>
+          <w:b w:val="0"/>
+          <w:i w:val="0"/>
+          <w:sz w:val="18"/>
+        </w:rPr>
+        <w:t>ab</w:t>
+      </w:r>
+      <w:r>
+        <w:rPr>
+          <w:rFonts w:ascii="Times New Roman" w:hAnsi="Times New Roman" w:cs="Times New Roman"/>
+          <w:b w:val="0"/>
+          <w:i w:val="0"/>
+          <w:sz w:val="24"/>
+        </w:rPr>
+        <w:t>/</w:t>
+      </w:r>
+      <w:r>
+        <w:rPr>
+          <w:rFonts w:ascii="Consolas" w:hAnsi="Consolas" w:cs="Consolas"/>
+          <w:b w:val="0"/>
+          <w:i w:val="0"/>
+          <w:sz w:val="18"/>
+        </w:rPr>
+        <w:t>autocannon</w:t>
+      </w:r>
+      <w:r>
+        <w:rPr>
+          <w:rFonts w:ascii="Times New Roman" w:hAnsi="Times New Roman" w:cs="Times New Roman"/>
+          <w:b w:val="0"/>
+          <w:i w:val="0"/>
+          <w:sz w:val="24"/>
+        </w:rPr>
+        <w:t xml:space="preserve"> contra </w:t>
+      </w:r>
+      <w:r>
+        <w:rPr>
+          <w:rFonts w:ascii="Consolas" w:hAnsi="Consolas" w:cs="Consolas"/>
+          <w:b w:val="0"/>
+          <w:i w:val="0"/>
+          <w:sz w:val="18"/>
+        </w:rPr>
+        <w:t>/health</w:t>
+      </w:r>
+      <w:r>
+        <w:rPr>
+          <w:rFonts w:ascii="Times New Roman" w:hAnsi="Times New Roman" w:cs="Times New Roman"/>
+          <w:b w:val="0"/>
+          <w:i w:val="0"/>
+          <w:sz w:val="24"/>
+        </w:rPr>
+        <w:t xml:space="preserve"> y </w:t>
+      </w:r>
+      <w:r>
+        <w:rPr>
+          <w:rFonts w:ascii="Consolas" w:hAnsi="Consolas" w:cs="Consolas"/>
+          <w:b w:val="0"/>
+          <w:i w:val="0"/>
+          <w:sz w:val="18"/>
+        </w:rPr>
+        <w:t>/api/v1/*</w:t>
+      </w:r>
+      <w:r>
+        <w:rPr>
+          <w:rFonts w:ascii="Times New Roman" w:hAnsi="Times New Roman" w:cs="Times New Roman"/>
+          <w:b w:val="0"/>
+          <w:i w:val="0"/>
+          <w:sz w:val="24"/>
+        </w:rPr>
+        <w:t xml:space="preserve"> tras el despliegue.</w:t>
       </w:r>
     </w:p>
     <w:p>
@@ -7650,11 +8332,20 @@
       <w:r>
         <w:rPr>
           <w:rFonts w:ascii="Times New Roman" w:hAnsi="Times New Roman" w:cs="Times New Roman"/>
+          <w:b w:val="0"/>
+          <w:i w:val="0"/>
+          <w:sz w:val="24"/>
+        </w:rPr>
+        <w:t xml:space="preserve">~~No hay umbrales de rendimiento definidos~~ — </w:t>
+      </w:r>
+      <w:r>
+        <w:rPr>
+          <w:rFonts w:ascii="Times New Roman" w:hAnsi="Times New Roman" w:cs="Times New Roman"/>
           <w:b/>
           <w:i w:val="0"/>
           <w:sz w:val="24"/>
         </w:rPr>
-        <w:t>No hay umbrales de rendimiento definidos</w:t>
+        <w:t>resuelto</w:t>
       </w:r>
       <w:r>
         <w:rPr>
@@ -7663,7 +8354,43 @@
           <w:i w:val="0"/>
           <w:sz w:val="24"/>
         </w:rPr>
-        <w:t xml:space="preserve"> (latencia, tasa de error) para el criterio de aceptación de la sección 9.</w:t>
+        <w:t>: la sección 9 ahora documenta el SLA real ya verificado en CI (</w:t>
+      </w:r>
+      <w:r>
+        <w:rPr>
+          <w:rFonts w:ascii="Consolas" w:hAnsi="Consolas" w:cs="Consolas"/>
+          <w:b w:val="0"/>
+          <w:i w:val="0"/>
+          <w:sz w:val="18"/>
+        </w:rPr>
+        <w:t>backend/tests/performance/api-performance.perf.test.ts</w:t>
+      </w:r>
+      <w:r>
+        <w:rPr>
+          <w:rFonts w:ascii="Times New Roman" w:hAnsi="Times New Roman" w:cs="Times New Roman"/>
+          <w:b w:val="0"/>
+          <w:i w:val="0"/>
+          <w:sz w:val="24"/>
+        </w:rPr>
+        <w:t xml:space="preserve"> y </w:t>
+      </w:r>
+      <w:r>
+        <w:rPr>
+          <w:rFonts w:ascii="Consolas" w:hAnsi="Consolas" w:cs="Consolas"/>
+          <w:b w:val="0"/>
+          <w:i w:val="0"/>
+          <w:sz w:val="18"/>
+        </w:rPr>
+        <w:t>concurrency.perf.test.ts</w:t>
+      </w:r>
+      <w:r>
+        <w:rPr>
+          <w:rFonts w:ascii="Times New Roman" w:hAnsi="Times New Roman" w:cs="Times New Roman"/>
+          <w:b w:val="0"/>
+          <w:i w:val="0"/>
+          <w:sz w:val="24"/>
+        </w:rPr>
+        <w:t>): mean/p95/p99 por tipo de endpoint y throughput mínimo ≥ 5 req/s.</w:t>
       </w:r>
     </w:p>
     <w:p>

</xml_diff>